<commit_message>
metaanalysis/paper_v2: prepare Frontiers in Education resubmission
- Add Frontiers in Education cover letter template (author-initiated
  resubmission flow with summary of v2 changes since the initial
  Frontiers submission)
- Rename "Data and Code Availability" -> "Data Availability Statement"
  to match Frontiers Author Guidelines
- Fix "Sahinidis & Tsaknis's 30-item custom scale" -> "Sahinidis and
  Tsaknis's (2021) 30-item custom scale" so the citation matches the
  reference list (resolves the only T5 audit warning)
- Rebuild manuscript_journal_v2.docx, manuscript_preprint_v2.docx,
  split/, and all four cover letters; T1-T7 + T9 dry-run all pass with
  zero failures and zero warnings
</commit_message>
<xml_diff>
--- a/metaanalysis/paper_v2/manuscript_journal_v2.docx
+++ b/metaanalysis/paper_v2/manuscript_journal_v2.docx
@@ -320,7 +320,7 @@
           <w:b/>
           <w:sz w:val="24"/>
         </w:rPr>
-        <w:t>Data and Code Availability</w:t>
+        <w:t>Data Availability Statement</w:t>
       </w:r>
     </w:p>
     <w:p>
@@ -3477,7 +3477,7 @@
           <w:rFonts w:ascii="Times New Roman" w:hAnsi="Times New Roman" w:eastAsia="Times New Roman"/>
           <w:sz w:val="24"/>
         </w:rPr>
-        <w:t>Personality measurement instruments used across the 25 retained studies comprised the Big Five Inventory family (BFI-44, BFI-2, BFI-S; 13 studies), the NEO Personality Inventory family (NEO-FFI; 2 studies), the International Personality Item Pool (IPIP, Mini-IPIP; 3 studies), the HEXACO Personality Inventory (1 study: A-19 MacLean, 2022), the Ten-Item Personality Inventory (TIPI, TIPI-J; 2 studies: A-31 Rivers, A-37 Zheng &amp; Zheng), and other validated Big Five–aligned scales (Sahinidis &amp; Tsaknis's 30-item custom scale, Chinese-language Big Five scales of A-20 Mustafa et al. (2022) and A-26 Wang et al. (2023), and McCrae's 40-item scale used in A-28 Yu; 4 studies in total). Achievement outcomes in the 10-study primary pool were operationalized as GPA or course grade (6 studies: A-02 Alkis, A-23 Rodrigues, A-29 Bahçekapılı, A-31 Rivers, A-37 Zheng &amp; Zheng, plus the paper-grade subscale of A-01 Abe), standardized exam (1 study: A-15 Elvers Intro-Psych exam), MOOC platform composite (1 study: A-28 Yu), and self-rated performance (2 studies: A-22 Quigley OSES subscale; A-30 Kaspar self-rated performance composite). Secondary outcomes — satisfaction, engagement, preference, or perception — were the only available outcome in the remaining 15 retained studies and were not pooled into the primary achievement meta-analysis.</w:t>
+        <w:t>Personality measurement instruments used across the 25 retained studies comprised the Big Five Inventory family (BFI-44, BFI-2, BFI-S; 13 studies), the NEO Personality Inventory family (NEO-FFI; 2 studies), the International Personality Item Pool (IPIP, Mini-IPIP; 3 studies), the HEXACO Personality Inventory (1 study: A-19 MacLean, 2022), the Ten-Item Personality Inventory (TIPI, TIPI-J; 2 studies: A-31 Rivers, A-37 Zheng &amp; Zheng), and other validated Big Five–aligned scales (Sahinidis and Tsaknis's (2021) 30-item custom scale, Chinese-language Big Five scales of A-20 Mustafa et al. (2022) and A-26 Wang et al. (2023), and McCrae's 40-item scale used in A-28 Yu; 4 studies in total). Achievement outcomes in the 10-study primary pool were operationalized as GPA or course grade (6 studies: A-02 Alkis, A-23 Rodrigues, A-29 Bahçekapılı, A-31 Rivers, A-37 Zheng &amp; Zheng, plus the paper-grade subscale of A-01 Abe), standardized exam (1 study: A-15 Elvers Intro-Psych exam), MOOC platform composite (1 study: A-28 Yu), and self-rated performance (2 studies: A-22 Quigley OSES subscale; A-30 Kaspar self-rated performance composite). Secondary outcomes — satisfaction, engagement, preference, or perception — were the only available outcome in the remaining 15 retained studies and were not pooled into the primary achievement meta-analysis.</w:t>
       </w:r>
     </w:p>
     <w:p>

</xml_diff>

<commit_message>
metaanalysis/paper_v2: address Springer HSSC technical-check 4-point feedback
Resubmission against Manuscript ID 72427190-7674-4b5f-ac51-9518b8c16eaf:

- Ethics Approval subsection: now states explicitly that no IRB or
  Research Ethics Committee approval was required (no new primary data),
  and references the Declaration of Helsinki (as revised in 2013) and
  PRISMA 2020 as the conduct/reporting standards followed
- New "Consent to Participate" subsection (replaces previous "Informed
  Consent" wording with the Springer-required terminology)
- New "Consent for Publication" subsection
- New explicit summary line "Human Ethics and Consent to Participate
  Declarations: Not applicable"
- Add cover_letter_hssc_springer.docx with point-by-point response to
  the four technical-check items
- Rebuild all artifacts; T1-T7 + T9 dry-run all pass with zero failures
</commit_message>
<xml_diff>
--- a/metaanalysis/paper_v2/manuscript_journal_v2.docx
+++ b/metaanalysis/paper_v2/manuscript_journal_v2.docx
@@ -242,7 +242,7 @@
           <w:rFonts w:ascii="Times New Roman" w:hAnsi="Times New Roman" w:eastAsia="Times New Roman"/>
           <w:sz w:val="24"/>
         </w:rPr>
-        <w:t>Not applicable. This meta-analysis synthesizes data from previously published studies and does not involve direct collection of data from human participants. Ethical approval for the original studies was the responsibility of the authors of those studies.</w:t>
+        <w:t>Not applicable. This study is a systematic review and meta-analysis of previously published quantitative research and did not involve any direct collection of data from human participants by the present author. As no new primary data were collected, no Institutional Review Board (IRB) or Research Ethics Committee approval was required for the conduct of this synthesis. The conduct of this review followed the ethical principles outlined in the Declaration of Helsinki (as revised in 2013) and the PRISMA 2020 reporting guidelines for systematic reviews. Ethical approval for each of the included primary studies was the responsibility of the original investigators of those studies, as documented in their respective publications.</w:t>
       </w:r>
     </w:p>
     <w:p>
@@ -260,7 +260,7 @@
           <w:b/>
           <w:sz w:val="24"/>
         </w:rPr>
-        <w:t>Informed Consent</w:t>
+        <w:t>Consent to Participate</w:t>
       </w:r>
     </w:p>
     <w:p>
@@ -272,7 +272,67 @@
           <w:rFonts w:ascii="Times New Roman" w:hAnsi="Times New Roman" w:eastAsia="Times New Roman"/>
           <w:sz w:val="24"/>
         </w:rPr>
-        <w:t>Not applicable. All included studies obtained informed consent from their participants in accordance with institutional and journal requirements at the time of original data collection.</w:t>
+        <w:t>Not applicable. This systematic review and meta-analysis did not involve any direct interaction with, or recruitment of, human participants by the present author. Informed consent and consent to participate for the underlying data were obtained by the original investigators of each included primary study at the time of original data collection, in accordance with the institutional and ethical standards applicable at that time.</w:t>
+      </w:r>
+    </w:p>
+    <w:p>
+      <w:pPr>
+        <w:spacing w:line="480" w:lineRule="auto" w:before="0" w:after="0"/>
+      </w:pPr>
+    </w:p>
+    <w:p>
+      <w:pPr>
+        <w:spacing w:line="480" w:lineRule="auto" w:before="0" w:after="0"/>
+      </w:pPr>
+      <w:r>
+        <w:rPr>
+          <w:rFonts w:ascii="Times New Roman" w:hAnsi="Times New Roman" w:eastAsia="Times New Roman"/>
+          <w:b/>
+          <w:sz w:val="24"/>
+        </w:rPr>
+        <w:t>Consent for Publication</w:t>
+      </w:r>
+    </w:p>
+    <w:p>
+      <w:pPr>
+        <w:spacing w:line="480" w:lineRule="auto" w:before="0" w:after="0"/>
+      </w:pPr>
+      <w:r>
+        <w:rPr>
+          <w:rFonts w:ascii="Times New Roman" w:hAnsi="Times New Roman" w:eastAsia="Times New Roman"/>
+          <w:sz w:val="24"/>
+        </w:rPr>
+        <w:t>Not applicable. This manuscript does not contain any individual person's data in any form (including individual details, images, or videos).</w:t>
+      </w:r>
+    </w:p>
+    <w:p>
+      <w:pPr>
+        <w:spacing w:line="480" w:lineRule="auto" w:before="0" w:after="0"/>
+      </w:pPr>
+    </w:p>
+    <w:p>
+      <w:pPr>
+        <w:spacing w:line="480" w:lineRule="auto" w:before="0" w:after="0"/>
+      </w:pPr>
+      <w:r>
+        <w:rPr>
+          <w:rFonts w:ascii="Times New Roman" w:hAnsi="Times New Roman" w:eastAsia="Times New Roman"/>
+          <w:b/>
+          <w:sz w:val="24"/>
+        </w:rPr>
+        <w:t>Human Ethics and Consent to Participate Declarations</w:t>
+      </w:r>
+    </w:p>
+    <w:p>
+      <w:pPr>
+        <w:spacing w:line="480" w:lineRule="auto" w:before="0" w:after="0"/>
+      </w:pPr>
+      <w:r>
+        <w:rPr>
+          <w:rFonts w:ascii="Times New Roman" w:hAnsi="Times New Roman" w:eastAsia="Times New Roman"/>
+          <w:sz w:val="24"/>
+        </w:rPr>
+        <w:t>Not applicable.</w:t>
       </w:r>
     </w:p>
     <w:p>

</xml_diff>